<commit_message>
Policy workshop: the three-mechanism model + reading the color groups
New section after the author step: why most concepts have no method
(Apply = mapping-based binding for every term; identification =
value-based recognition for stable shapes; business rules = semantics),
how to read the app's color-coded skipped groups (amber seedable, teal
mapping, purple rules, gray table/folder level), and how drift-check
closes the loop. Docx regenerated.

Co-Authored-By: Claude Fable 5 <noreply@anthropic.com>
</commit_message>
<xml_diff>
--- a/courseware/CSCU/Policy/Workshop-Policy-Generator-CSCU.docx
+++ b/courseware/CSCU/Policy/Workshop-Policy-Generator-CSCU.docx
@@ -857,6 +857,486 @@
       </w:r>
       <w:r>
         <w:t xml:space="preserve">, with the reason — a concept detected only by name/context has no evidence to author from, and guessing is exactly what this pipeline exists to avoid.</w:t>
+      </w:r>
+    </w:p>
+    <w:p>
+      <w:pPr>
+        <w:pStyle w:val="Heading2"/>
+      </w:pPr>
+      <w:r>
+        <w:t xml:space="preserve">Why most concepts have no method — the three mechanisms</w:t>
+      </w:r>
+    </w:p>
+    <w:p>
+      <w:pPr>
+        <w:spacing w:after="120"/>
+      </w:pPr>
+      <w:r>
+        <w:t xml:space="preserve">Expect the skipped list to be </w:t>
+      </w:r>
+      <w:r>
+        <w:rPr>
+          <w:b/>
+          <w:bCs/>
+        </w:rPr>
+        <w:t xml:space="preserve">most of the glossary</w:t>
+      </w:r>
+      <w:r>
+        <w:t xml:space="preserve">, and expect that to be correct. Identification methods are only one of three mechanisms that apply and check governed terms — the app color-codes the skipped list by which mechanism owns each term:</w:t>
+      </w:r>
+    </w:p>
+    <w:tbl>
+      <w:tblPr>
+        <w:tblW w:w="9360" w:type="dxa"/>
+        <w:tblBorders>
+          <w:top w:val="single" w:sz="4" w:space="0" w:color="C9DEE8"/>
+          <w:left w:val="single" w:sz="4" w:space="0" w:color="C9DEE8"/>
+          <w:bottom w:val="single" w:sz="4" w:space="0" w:color="C9DEE8"/>
+          <w:right w:val="single" w:sz="4" w:space="0" w:color="C9DEE8"/>
+          <w:insideH w:val="single" w:sz="4" w:space="0" w:color="C9DEE8"/>
+          <w:insideV w:val="single" w:sz="4" w:space="0" w:color="C9DEE8"/>
+        </w:tblBorders>
+      </w:tblPr>
+      <w:tblGrid>
+        <w:gridCol w:w="2500"/>
+        <w:gridCol w:w="3430"/>
+        <w:gridCol w:w="3430"/>
+      </w:tblGrid>
+      <w:tr>
+        <w:tc>
+          <w:tcPr>
+            <w:tcW w:w="2500" w:type="dxa"/>
+            <w:shd w:val="clear" w:color="auto" w:fill="EEF6FA"/>
+            <w:tcBorders>
+              <w:left w:val="single" w:sz="12" w:space="0" w:color="065A82"/>
+            </w:tcBorders>
+            <w:tcMar>
+              <w:top w:w="120" w:type="dxa"/>
+              <w:left w:w="180" w:type="dxa"/>
+              <w:bottom w:w="120" w:type="dxa"/>
+              <w:right w:w="180" w:type="dxa"/>
+            </w:tcMar>
+          </w:tcPr>
+          <w:p>
+            <w:pPr>
+              <w:spacing w:after="0"/>
+            </w:pPr>
+            <w:r>
+              <w:rPr>
+                <w:b/>
+                <w:bCs/>
+              </w:rPr>
+              <w:t xml:space="preserve">Mechanism</w:t>
+            </w:r>
+          </w:p>
+        </w:tc>
+        <w:tc>
+          <w:tcPr>
+            <w:tcW w:w="3430" w:type="dxa"/>
+            <w:shd w:val="clear" w:color="auto" w:fill="EEF6FA"/>
+            <w:tcMar>
+              <w:top w:w="120" w:type="dxa"/>
+              <w:left w:w="180" w:type="dxa"/>
+              <w:bottom w:w="120" w:type="dxa"/>
+              <w:right w:w="180" w:type="dxa"/>
+            </w:tcMar>
+          </w:tcPr>
+          <w:p>
+            <w:pPr>
+              <w:spacing w:after="0"/>
+            </w:pPr>
+            <w:r>
+              <w:rPr>
+                <w:b/>
+                <w:bCs/>
+              </w:rPr>
+              <w:t xml:space="preserve">What it covers</w:t>
+            </w:r>
+          </w:p>
+        </w:tc>
+        <w:tc>
+          <w:tcPr>
+            <w:tcW w:w="3430" w:type="dxa"/>
+            <w:shd w:val="clear" w:color="auto" w:fill="EEF6FA"/>
+            <w:tcMar>
+              <w:top w:w="120" w:type="dxa"/>
+              <w:left w:w="180" w:type="dxa"/>
+              <w:bottom w:w="120" w:type="dxa"/>
+              <w:right w:w="180" w:type="dxa"/>
+            </w:tcMar>
+          </w:tcPr>
+          <w:p>
+            <w:pPr>
+              <w:spacing w:after="0"/>
+            </w:pPr>
+            <w:r>
+              <w:rPr>
+                <w:b/>
+                <w:bCs/>
+              </w:rPr>
+              <w:t xml:space="preserve">Where it happens</w:t>
+            </w:r>
+          </w:p>
+        </w:tc>
+      </w:tr>
+      <w:tr>
+        <w:tc>
+          <w:tcPr>
+            <w:tcW w:w="2500" w:type="dxa"/>
+            <w:tcMar>
+              <w:top w:w="120" w:type="dxa"/>
+              <w:left w:w="180" w:type="dxa"/>
+              <w:bottom w:w="120" w:type="dxa"/>
+              <w:right w:w="180" w:type="dxa"/>
+            </w:tcMar>
+          </w:tcPr>
+          <w:p>
+            <w:pPr>
+              <w:spacing w:after="0"/>
+            </w:pPr>
+            <w:r>
+              <w:rPr>
+                <w:b/>
+                <w:bCs/>
+              </w:rPr>
+              <w:t xml:space="preserve">Apply</w:t>
+            </w:r>
+            <w:r>
+              <w:t xml:space="preserve"> (mapping-based binding)</w:t>
+            </w:r>
+          </w:p>
+        </w:tc>
+        <w:tc>
+          <w:tcPr>
+            <w:tcW w:w="3430" w:type="dxa"/>
+            <w:tcMar>
+              <w:top w:w="120" w:type="dxa"/>
+              <w:left w:w="180" w:type="dxa"/>
+              <w:bottom w:w="120" w:type="dxa"/>
+              <w:right w:w="180" w:type="dxa"/>
+            </w:tcMar>
+          </w:tcPr>
+          <w:p>
+            <w:pPr>
+              <w:spacing w:after="0"/>
+            </w:pPr>
+            <w:r>
+              <w:rPr>
+                <w:i/>
+                <w:iCs/>
+              </w:rPr>
+              <w:t xml:space="preserve">every</w:t>
+            </w:r>
+            <w:r>
+              <w:t xml:space="preserve"> reviewed term: the Glossary app PATCHes the term link, governed tags and sensitivity directly onto the mapped columns (the Registry's </w:t>
+            </w:r>
+            <w:r>
+              <w:rPr>
+                <w:rFonts w:ascii="Consolas" w:hAnsi="Consolas"/>
+                <w:color w:val="0A5560"/>
+                <w:sz w:val="20"/>
+                <w:szCs w:val="20"/>
+              </w:rPr>
+              <w:t xml:space="preserve">sources[]</w:t>
+            </w:r>
+            <w:r>
+              <w:t xml:space="preserve">)</w:t>
+            </w:r>
+          </w:p>
+        </w:tc>
+        <w:tc>
+          <w:tcPr>
+            <w:tcW w:w="3430" w:type="dxa"/>
+            <w:tcMar>
+              <w:top w:w="120" w:type="dxa"/>
+              <w:left w:w="180" w:type="dxa"/>
+              <w:bottom w:w="120" w:type="dxa"/>
+              <w:right w:w="180" w:type="dxa"/>
+            </w:tcMar>
+          </w:tcPr>
+          <w:p>
+            <w:pPr>
+              <w:spacing w:after="0"/>
+            </w:pPr>
+            <w:r>
+              <w:t xml:space="preserve">Glossary app → Apply to PDC</w:t>
+            </w:r>
+          </w:p>
+        </w:tc>
+      </w:tr>
+      <w:tr>
+        <w:tc>
+          <w:tcPr>
+            <w:tcW w:w="2500" w:type="dxa"/>
+            <w:tcMar>
+              <w:top w:w="120" w:type="dxa"/>
+              <w:left w:w="180" w:type="dxa"/>
+              <w:bottom w:w="120" w:type="dxa"/>
+              <w:right w:w="180" w:type="dxa"/>
+            </w:tcMar>
+          </w:tcPr>
+          <w:p>
+            <w:pPr>
+              <w:spacing w:after="0"/>
+            </w:pPr>
+            <w:r>
+              <w:rPr>
+                <w:b/>
+                <w:bCs/>
+              </w:rPr>
+              <w:t xml:space="preserve">Identification methods</w:t>
+            </w:r>
+            <w:r>
+              <w:t xml:space="preserve"> (value-based recognition)</w:t>
+            </w:r>
+          </w:p>
+        </w:tc>
+        <w:tc>
+          <w:tcPr>
+            <w:tcW w:w="3430" w:type="dxa"/>
+            <w:tcMar>
+              <w:top w:w="120" w:type="dxa"/>
+              <w:left w:w="180" w:type="dxa"/>
+              <w:bottom w:w="120" w:type="dxa"/>
+              <w:right w:w="180" w:type="dxa"/>
+            </w:tcMar>
+          </w:tcPr>
+          <w:p>
+            <w:pPr>
+              <w:spacing w:after="0"/>
+            </w:pPr>
+            <w:r>
+              <w:t xml:space="preserve">only concepts with a stable value shape — an induced format or a reference list. Their job is </w:t>
+            </w:r>
+            <w:r>
+              <w:rPr>
+                <w:i/>
+                <w:iCs/>
+              </w:rPr>
+              <w:t xml:space="preserve">new and unknown</w:t>
+            </w:r>
+            <w:r>
+              <w:t xml:space="preserve"> data: a new table, a file in the bucket, a rogue column</w:t>
+            </w:r>
+          </w:p>
+        </w:tc>
+        <w:tc>
+          <w:tcPr>
+            <w:tcW w:w="3430" w:type="dxa"/>
+            <w:tcMar>
+              <w:top w:w="120" w:type="dxa"/>
+              <w:left w:w="180" w:type="dxa"/>
+              <w:bottom w:w="120" w:type="dxa"/>
+              <w:right w:w="180" w:type="dxa"/>
+            </w:tcMar>
+          </w:tcPr>
+          <w:p>
+            <w:pPr>
+              <w:spacing w:after="0"/>
+            </w:pPr>
+            <w:r>
+              <w:t xml:space="preserve">this app's authored set — custom methods only</w:t>
+            </w:r>
+          </w:p>
+        </w:tc>
+      </w:tr>
+      <w:tr>
+        <w:tc>
+          <w:tcPr>
+            <w:tcW w:w="2500" w:type="dxa"/>
+            <w:tcMar>
+              <w:top w:w="120" w:type="dxa"/>
+              <w:left w:w="180" w:type="dxa"/>
+              <w:bottom w:w="120" w:type="dxa"/>
+              <w:right w:w="180" w:type="dxa"/>
+            </w:tcMar>
+          </w:tcPr>
+          <w:p>
+            <w:pPr>
+              <w:spacing w:after="0"/>
+            </w:pPr>
+            <w:r>
+              <w:rPr>
+                <w:b/>
+                <w:bCs/>
+              </w:rPr>
+              <w:t xml:space="preserve">Business rules</w:t>
+            </w:r>
+            <w:r>
+              <w:t xml:space="preserve"> (semantic checks)</w:t>
+            </w:r>
+          </w:p>
+        </w:tc>
+        <w:tc>
+          <w:tcPr>
+            <w:tcW w:w="3430" w:type="dxa"/>
+            <w:tcMar>
+              <w:top w:w="120" w:type="dxa"/>
+              <w:left w:w="180" w:type="dxa"/>
+              <w:bottom w:w="120" w:type="dxa"/>
+              <w:right w:w="180" w:type="dxa"/>
+            </w:tcMar>
+          </w:tcPr>
+          <w:p>
+            <w:pPr>
+              <w:spacing w:after="0"/>
+            </w:pPr>
+            <w:r>
+              <w:t xml:space="preserve">what no shape can express: opt-out honoured, CVV must be absent, SSNs must not appear in </w:t>
+            </w:r>
+            <w:r>
+              <w:rPr>
+                <w:rFonts w:ascii="Consolas" w:hAnsi="Consolas"/>
+                <w:color w:val="0A5560"/>
+                <w:sz w:val="20"/>
+                <w:szCs w:val="20"/>
+              </w:rPr>
+              <w:t xml:space="preserve">note_txt</w:t>
+            </w:r>
+          </w:p>
+        </w:tc>
+        <w:tc>
+          <w:tcPr>
+            <w:tcW w:w="3430" w:type="dxa"/>
+            <w:tcMar>
+              <w:top w:w="120" w:type="dxa"/>
+              <w:left w:w="180" w:type="dxa"/>
+              <w:bottom w:w="120" w:type="dxa"/>
+              <w:right w:w="180" w:type="dxa"/>
+            </w:tcMar>
+          </w:tcPr>
+          <w:p>
+            <w:pPr>
+              <w:spacing w:after="0"/>
+            </w:pPr>
+            <w:r>
+              <w:t xml:space="preserve">Workshop 04 rules + Trust Score</w:t>
+            </w:r>
+          </w:p>
+        </w:tc>
+      </w:tr>
+    </w:tbl>
+    <w:p>
+      <w:pPr>
+        <w:spacing w:after="120"/>
+      </w:pPr>
+    </w:p>
+    <w:p>
+      <w:pPr>
+        <w:spacing w:after="120"/>
+      </w:pPr>
+      <w:r>
+        <w:t xml:space="preserve">Reading the color groups in the app:</w:t>
+      </w:r>
+    </w:p>
+    <w:p>
+      <w:pPr>
+        <w:pStyle w:val="ListParagraph"/>
+        <w:numPr>
+          <w:ilvl w:val="0"/>
+          <w:numId w:val="2"/>
+        </w:numPr>
+        <w:spacing w:after="60"/>
+      </w:pPr>
+      <w:r>
+        <w:rPr>
+          <w:b/>
+          <w:bCs/>
+        </w:rPr>
+        <w:t xml:space="preserve">Amber — should be value-recognizable.</w:t>
+      </w:r>
+      <w:r>
+        <w:t xml:space="preserve"> Canonical shapes (SSN, email, phone, ZIP) and reference lists (service cities). Give them seeds on the glossary side — re-scan with profiling, or add a </w:t>
+      </w:r>
+      <w:r>
+        <w:rPr>
+          <w:rFonts w:ascii="Consolas" w:hAnsi="Consolas"/>
+          <w:color w:val="0A5560"/>
+          <w:sz w:val="20"/>
+          <w:szCs w:val="20"/>
+        </w:rPr>
+        <w:t xml:space="preserve">curated_seeds</w:t>
+      </w:r>
+      <w:r>
+        <w:t xml:space="preserve"> entry to the domain pack — and they become fully auditable custom methods (the custom-only program's replacement for PDC's built-ins).</w:t>
+      </w:r>
+    </w:p>
+    <w:p>
+      <w:pPr>
+        <w:pStyle w:val="ListParagraph"/>
+        <w:numPr>
+          <w:ilvl w:val="0"/>
+          <w:numId w:val="2"/>
+        </w:numPr>
+        <w:spacing w:after="60"/>
+      </w:pPr>
+      <w:r>
+        <w:rPr>
+          <w:b/>
+          <w:bCs/>
+        </w:rPr>
+        <w:t xml:space="preserve">Teal — applied by mapping.</w:t>
+      </w:r>
+      <w:r>
+        <w:t xml:space="preserve"> Amounts, dates, ids, statuses, names: no stable shape, and none needed — Apply already governs them on their mapped columns.</w:t>
+      </w:r>
+    </w:p>
+    <w:p>
+      <w:pPr>
+        <w:pStyle w:val="ListParagraph"/>
+        <w:numPr>
+          <w:ilvl w:val="0"/>
+          <w:numId w:val="2"/>
+        </w:numPr>
+        <w:spacing w:after="60"/>
+      </w:pPr>
+      <w:r>
+        <w:rPr>
+          <w:b/>
+          <w:bCs/>
+        </w:rPr>
+        <w:t xml:space="preserve">Purple — business-rule territory.</w:t>
+      </w:r>
+      <w:r>
+        <w:t xml:space="preserve"> Free text and semantics; forcing a regex here is the free-text blind spot Workshop 05 warns about.</w:t>
+      </w:r>
+    </w:p>
+    <w:p>
+      <w:pPr>
+        <w:pStyle w:val="ListParagraph"/>
+        <w:numPr>
+          <w:ilvl w:val="0"/>
+          <w:numId w:val="2"/>
+        </w:numPr>
+        <w:spacing w:after="60"/>
+      </w:pPr>
+      <w:r>
+        <w:rPr>
+          <w:b/>
+          <w:bCs/>
+        </w:rPr>
+        <w:t xml:space="preserve">Gray — table/folder level.</w:t>
+      </w:r>
+      <w:r>
+        <w:t xml:space="preserve"> Record- and folder-level concepts govern whole tables and document folders through Apply; column-level identification does not apply.</w:t>
+      </w:r>
+    </w:p>
+    <w:p>
+      <w:pPr>
+        <w:spacing w:after="120"/>
+      </w:pPr>
+      <w:r>
+        <w:t xml:space="preserve">The loop is closed later by the </w:t>
+      </w:r>
+      <w:r>
+        <w:rPr>
+          <w:b/>
+          <w:bCs/>
+        </w:rPr>
+        <w:t xml:space="preserve">drift-check</w:t>
+      </w:r>
+      <w:r>
+        <w:t xml:space="preserve"> stage: deployed methods' Assign-Tags and PDC's live tag facet are compared against the Registry's governed vocabulary, so anything that stops matching what the glossary governs is flagged instead of drifting silently.</w:t>
       </w:r>
     </w:p>
     <w:p>

</xml_diff>

<commit_message>
Policy workshop: import instructions match the real PDC import format
patterns-import.zip / dictionaries-import.zip uploaded whole on the
Data Operations -> Data Identification Methods pages (the layout PDC's
own Export produces); output tree and checkpoint updated; docx rebuilt.

Co-Authored-By: Claude Fable 5 <noreply@anthropic.com>
</commit_message>
<xml_diff>
--- a/courseware/CSCU/Policy/Workshop-Policy-Generator-CSCU.docx
+++ b/courseware/CSCU/Policy/Workshop-Policy-Generator-CSCU.docx
@@ -193,7 +193,7 @@
           <w:b/>
           <w:bCs/>
         </w:rPr>
-        <w:t xml:space="preserve">Management → Data Identification</w:t>
+        <w:t xml:space="preserve">Data Operations → Data Identification Methods</w:t>
       </w:r>
       <w:r>
         <w:t xml:space="preserve">.</w:t>
@@ -355,19 +355,7 @@
         <w:t xml:space="preserve">patternsRules</w:t>
       </w:r>
       <w:r>
-        <w:t xml:space="preserve"> JSON) per regex seed, one Dictionary (</w:t>
-      </w:r>
-      <w:r>
-        <w:rPr>
-          <w:rFonts w:ascii="Consolas" w:hAnsi="Consolas"/>
-          <w:color w:val="0A5560"/>
-          <w:sz w:val="20"/>
-          <w:szCs w:val="20"/>
-        </w:rPr>
-        <w:t xml:space="preserve">dictionariesRules</w:t>
-      </w:r>
-      <w:r>
-        <w:t xml:space="preserve"> JSON + values CSV) per reference-list seed, each assigning the Registry's governed tags (</w:t>
+        <w:t xml:space="preserve"> JSON) per regex seed, one Dictionary (definition JSON + values CSV) per reference-list seed, each assigning the Registry's governed tags (</w:t>
       </w:r>
       <w:r>
         <w:rPr>
@@ -762,7 +750,7 @@
           <w:szCs w:val="19"/>
           <w:color w:val="0A3D52"/>
         </w:rPr>
-        <w:t xml:space="preserve">  Patterns/          one cscu_&lt;term&gt;.json per regex seed             (patternsRules)</w:t>
+        <w:t xml:space="preserve">  patterns-import.zip        one cscu_&lt;term&gt;.json per pattern (flat) — the</w:t>
       </w:r>
     </w:p>
     <w:p>
@@ -781,7 +769,7 @@
           <w:szCs w:val="19"/>
           <w:color w:val="0A3D52"/>
         </w:rPr>
-        <w:t xml:space="preserve">  Dictionaries/      one cscu_&lt;term&gt;_rule.json + cscu_&lt;term&gt;.csv</w:t>
+        <w:t xml:space="preserve">                             exact layout PDC's own Pattern Export produces</w:t>
       </w:r>
     </w:p>
     <w:p>
@@ -800,7 +788,7 @@
           <w:szCs w:val="19"/>
           <w:color w:val="0A3D52"/>
         </w:rPr>
-        <w:t xml:space="preserve">                     per reference-list seed                         (dictionariesRules)</w:t>
+        <w:t xml:space="preserve">  dictionaries-import.zip    one nested cscu_&lt;term&gt;.zip per dictionary,</w:t>
       </w:r>
     </w:p>
     <w:p>
@@ -819,7 +807,45 @@
           <w:szCs w:val="19"/>
           <w:color w:val="0A3D52"/>
         </w:rPr>
-        <w:t xml:space="preserve">  INDEX.csv          kind, rule name, file, term, term_id</w:t>
+        <w:t xml:space="preserve">                             pairing the definition JSON with its Term-header</w:t>
+      </w:r>
+    </w:p>
+    <w:p>
+      <w:pPr>
+        <w:pBdr>
+          <w:left w:val="single" w:sz="12" w:space="8" w:color="1C7293"/>
+        </w:pBdr>
+        <w:shd w:val="clear" w:color="auto" w:fill="F4F7F9"/>
+        <w:spacing w:before="0" w:after="0"/>
+        <w:ind w:left="240"/>
+      </w:pPr>
+      <w:r>
+        <w:rPr>
+          <w:rFonts w:ascii="Consolas" w:hAnsi="Consolas"/>
+          <w:sz w:val="19"/>
+          <w:szCs w:val="19"/>
+          <w:color w:val="0A3D52"/>
+        </w:rPr>
+        <w:t xml:space="preserve">                             values CSV — PDC's Dictionary Export layout</w:t>
+      </w:r>
+    </w:p>
+    <w:p>
+      <w:pPr>
+        <w:pBdr>
+          <w:left w:val="single" w:sz="12" w:space="8" w:color="1C7293"/>
+        </w:pBdr>
+        <w:shd w:val="clear" w:color="auto" w:fill="F4F7F9"/>
+        <w:spacing w:before="0" w:after="0"/>
+        <w:ind w:left="240"/>
+      </w:pPr>
+      <w:r>
+        <w:rPr>
+          <w:rFonts w:ascii="Consolas" w:hAnsi="Consolas"/>
+          <w:sz w:val="19"/>
+          <w:szCs w:val="19"/>
+          <w:color w:val="0A3D52"/>
+        </w:rPr>
+        <w:t xml:space="preserve">  INDEX.csv                  kind, rule name, file, term, term_id</w:t>
       </w:r>
     </w:p>
     <w:p>
@@ -838,7 +864,7 @@
           <w:szCs w:val="19"/>
           <w:color w:val="0A3D52"/>
         </w:rPr>
-        <w:t xml:space="preserve">  README.txt         import pointers</w:t>
+        <w:t xml:space="preserve">  README.txt                 import pointers</w:t>
       </w:r>
     </w:p>
     <w:p>
@@ -1572,7 +1598,7 @@
           <w:b/>
           <w:bCs/>
         </w:rPr>
-        <w:t xml:space="preserve">Management → Data Identification</w:t>
+        <w:t xml:space="preserve">Data Operations → Data Identification Methods</w:t>
       </w:r>
       <w:r>
         <w:t xml:space="preserve">:</w:t>
@@ -1595,7 +1621,7 @@
         <w:t xml:space="preserve">Patterns → Import</w:t>
       </w:r>
       <w:r>
-        <w:t xml:space="preserve"> — select the files under </w:t>
+        <w:t xml:space="preserve"> — upload </w:t>
       </w:r>
       <w:r>
         <w:rPr>
@@ -1604,10 +1630,10 @@
           <w:sz w:val="20"/>
           <w:szCs w:val="20"/>
         </w:rPr>
-        <w:t xml:space="preserve">out/Patterns/</w:t>
-      </w:r>
-      <w:r>
-        <w:t xml:space="preserve">.</w:t>
+        <w:t xml:space="preserve">patterns-import.zip</w:t>
+      </w:r>
+      <w:r>
+        <w:t xml:space="preserve"> (the whole zip).</w:t>
       </w:r>
     </w:p>
     <w:p>
@@ -1627,7 +1653,7 @@
         <w:t xml:space="preserve">Dictionaries → Import</w:t>
       </w:r>
       <w:r>
-        <w:t xml:space="preserve"> — select each </w:t>
+        <w:t xml:space="preserve"> — upload </w:t>
       </w:r>
       <w:r>
         <w:rPr>
@@ -1636,22 +1662,28 @@
           <w:sz w:val="20"/>
           <w:szCs w:val="20"/>
         </w:rPr>
-        <w:t xml:space="preserve">*_rule.json</w:t>
-      </w:r>
-      <w:r>
-        <w:t xml:space="preserve"> with its values CSV under </w:t>
-      </w:r>
-      <w:r>
-        <w:rPr>
-          <w:rFonts w:ascii="Consolas" w:hAnsi="Consolas"/>
-          <w:color w:val="0A5560"/>
-          <w:sz w:val="20"/>
-          <w:szCs w:val="20"/>
-        </w:rPr>
-        <w:t xml:space="preserve">out/Dictionaries/</w:t>
-      </w:r>
-      <w:r>
-        <w:t xml:space="preserve">.</w:t>
+        <w:t xml:space="preserve">dictionaries-import.zip</w:t>
+      </w:r>
+      <w:r>
+        <w:t xml:space="preserve"> (the whole zip; each nested zip pairs a definition JSON with its values CSV).</w:t>
+      </w:r>
+    </w:p>
+    <w:p>
+      <w:pPr>
+        <w:spacing w:after="120"/>
+      </w:pPr>
+      <w:r>
+        <w:t xml:space="preserve">Both zips are in the exact layout PDC's own </w:t>
+      </w:r>
+      <w:r>
+        <w:rPr>
+          <w:b/>
+          <w:bCs/>
+        </w:rPr>
+        <w:t xml:space="preserve">Export</w:t>
+      </w:r>
+      <w:r>
+        <w:t xml:space="preserve"> produces — that is the import contract, and it's why the app emits it byte-compatible.</w:t>
       </w:r>
     </w:p>
     <w:p>
@@ -2187,7 +2219,7 @@
                 <w:sz w:val="20"/>
                 <w:szCs w:val="20"/>
               </w:rPr>
-              <w:t xml:space="preserve">out/Patterns/</w:t>
+              <w:t xml:space="preserve">patterns-import.zip</w:t>
             </w:r>
             <w:r>
               <w:t xml:space="preserve"> + </w:t>
@@ -2199,7 +2231,7 @@
                 <w:sz w:val="20"/>
                 <w:szCs w:val="20"/>
               </w:rPr>
-              <w:t xml:space="preserve">out/Dictionaries/</w:t>
+              <w:t xml:space="preserve">dictionaries-import.zip</w:t>
             </w:r>
             <w:r>
               <w:t xml:space="preserve"> + </w:t>

</xml_diff>

<commit_message>
Policy workshop: envelope-format wording in build/review sections
Co-Authored-By: Claude Fable 5 <noreply@anthropic.com>
</commit_message>
<xml_diff>
--- a/courseware/CSCU/Policy/Workshop-Policy-Generator-CSCU.docx
+++ b/courseware/CSCU/Policy/Workshop-Policy-Generator-CSCU.docx
@@ -343,19 +343,7 @@
         <w:t xml:space="preserve">Data Identification method set</w:t>
       </w:r>
       <w:r>
-        <w:t xml:space="preserve"> for CSCU — one Data Pattern (</w:t>
-      </w:r>
-      <w:r>
-        <w:rPr>
-          <w:rFonts w:ascii="Consolas" w:hAnsi="Consolas"/>
-          <w:color w:val="0A5560"/>
-          <w:sz w:val="20"/>
-          <w:szCs w:val="20"/>
-        </w:rPr>
-        <w:t xml:space="preserve">patternsRules</w:t>
-      </w:r>
-      <w:r>
-        <w:t xml:space="preserve"> JSON) per regex seed, one Dictionary (definition JSON + values CSV) per reference-list seed, each assigning the Registry's governed tags (</w:t>
+        <w:t xml:space="preserve"> for CSCU — one DataPattern envelope per regex seed, one Dictionary envelope (definition JSON + values CSV) per reference-list seed — the exact format PDC's own Export produces — each assigning the Registry's governed tags (</w:t>
       </w:r>
       <w:r>
         <w:rPr>
@@ -1476,10 +1464,10 @@
           <w:b/>
           <w:bCs/>
         </w:rPr>
-        <w:t xml:space="preserve">contentPatterns</w:t>
-      </w:r>
-      <w:r>
-        <w:t xml:space="preserve"> — the induced value signature (e.g. </w:t>
+        <w:t xml:space="preserve">regexMatch / profilePatterns</w:t>
+      </w:r>
+      <w:r>
+        <w:t xml:space="preserve"> — the induced value regex (e.g. </w:t>
       </w:r>
       <w:r>
         <w:rPr>
@@ -1491,7 +1479,7 @@
         <w:t xml:space="preserve">^CSCU-\d{6}$</w:t>
       </w:r>
       <w:r>
-        <w:t xml:space="preserve"> for member numbers). This came from profiled sample values.</w:t>
+        <w:t xml:space="preserve"> for member numbers) and its position signature. Both came from profiled sample values.</w:t>
       </w:r>
     </w:p>
     <w:p>

</xml_diff>

<commit_message>
Policy workshop: PDC editor condition-hydration caveat (edit via re-import); docx rebuilt
Co-Authored-By: Claude Fable 5 <noreply@anthropic.com>
</commit_message>
<xml_diff>
--- a/courseware/CSCU/Policy/Workshop-Policy-Generator-CSCU.docx
+++ b/courseware/CSCU/Policy/Workshop-Policy-Generator-CSCU.docx
@@ -1672,6 +1672,46 @@
       </w:r>
       <w:r>
         <w:t xml:space="preserve"> produces — that is the import contract, and it's why the app emits it byte-compatible.</w:t>
+      </w:r>
+    </w:p>
+    <w:p>
+      <w:pPr>
+        <w:pBdr>
+          <w:left w:val="single" w:sz="12" w:space="8" w:color="065A82"/>
+        </w:pBdr>
+        <w:shd w:val="clear" w:color="auto" w:fill="EEF6FA"/>
+        <w:ind w:left="240" w:right="240"/>
+        <w:spacing w:before="120" w:after="160"/>
+      </w:pPr>
+      <w:r>
+        <w:rPr>
+          <w:b/>
+          <w:bCs/>
+        </w:rPr>
+        <w:t xml:space="preserve">Caveat:</w:t>
+      </w:r>
+      <w:r>
+        <w:t xml:space="preserve"> PDC's </w:t>
+      </w:r>
+      <w:r>
+        <w:rPr>
+          <w:i/>
+          <w:iCs/>
+        </w:rPr>
+        <w:t xml:space="preserve">edit</w:t>
+      </w:r>
+      <w:r>
+        <w:t xml:space="preserve"> form does not display an imported rule's condition, even though View → Rules shows it and it evaluates. Don't hand-edit imported methods — a save could persist the emptied condition. The governed change path is: adjust in the Policy Generator (or the Registry/pack) and </w:t>
+      </w:r>
+      <w:r>
+        <w:rPr>
+          <w:b/>
+          <w:bCs/>
+        </w:rPr>
+        <w:t xml:space="preserve">re-import</w:t>
+      </w:r>
+      <w:r>
+        <w:t xml:space="preserve"> — deterministic ids make re-imports clean updates.</w:t>
       </w:r>
     </w:p>
     <w:p>

</xml_diff>